<commit_message>
Explain in the response letter why Table 3's off-diagonal correlations were dropped
The reviewers saw a full correlation matrix among the methane trait
definitions in the submission. The revised Table 3 shows only each
definition against daily methane, so the letter now says why the other
correlations are gone, rather than leaving the reviewers to notice it.

Co-Authored-By: Claude Opus 5.5 <noreply@anthropic.com>
Claude-Session: https://claude.ai/code/session_011pcAjTufrABAdJ2Ewj7SR3
</commit_message>
<xml_diff>
--- a/manuscript/revised/Response_to_Reviewers_draft4.docx
+++ b/manuscript/revised/Response_to_Reviewers_draft4.docx
@@ -43,6 +43,18 @@
           <w:i w:val="0"/>
         </w:rPr>
         <w:t>We thank the Editor and both reviewers for their careful and constructive reading of our manuscript. Below we reproduce each comment in full followed by our response. In brief, we have (i) re-examined the genetic-parameter analysis in detail and added carbon dioxide as a trait in its own right; (ii) re-estimated the parameters used in the selection index analysis from a single trivariate model of methane (CH4), metabolic body weight (MBW) and CO2, and rebuilt the index analysis on them; and (iii) refocused that analysis on how alternative methane traits themselves operate within an index. It shows that a favourable region exists: holding MBW and CO2 at zero response reduces methane by 0.61 g/day per generation at a selection intensity of 1, and every methane trait examined, whether absolute, ratio or residual, reaches this response once appropriate weights on MBW and CO2 are included in the breeding goal. It is not an estimate of response to selection under a national breeding index, and it does not include economic weights or other breeding-goal traits. The re-estimated CH4–MBW genetic correlation (0.69 in the trivariate model; 0.72 in the bivariate model) differs substantially from the value used in the submitted index analysis (−0.03), so the index results differ from those of the submitted version and should be read as new results. The submitted value was also inconsistent with the CH4–live weight genetic correlation reported in the same submitted table (0.50), as MBW is a direct transformation of live weight; on re-estimation the two correlations agree (0.72 and 0.71; Table 5).</w:t>
+      </w:r>
+    </w:p>
+    <w:p>
+      <w:pPr>
+        <w:jc w:val="both"/>
+      </w:pPr>
+      <w:r>
+        <w:rPr>
+          <w:b w:val="0"/>
+          <w:i w:val="0"/>
+        </w:rPr>
+        <w:t>We have also restructured Table 3. The submitted version gave a full matrix of genetic and phenotypic correlations among all of the methane trait definitions. All genetic parameters were re-estimated for this revision, and the revised Table 3 now reports the genetic and phenotypic correlations of CO2 and of each alternative definition with daily methane, all from the re-estimated models. The 28 correlations among the alternative definitions themselves (for example, CH4/MM with RMTADG) have been removed. They were not re-estimated, and they are not needed for the conclusions of the paper, which concern how each definition relates to absolute methane and to the production traits (Tables 3 and 5). We removed them rather than present a single table mixing re-estimated values with values from the original analysis.</w:t>
       </w:r>
     </w:p>
     <w:p>

</xml_diff>